<commit_message>
Code error fixes. Could not run tests locally.
</commit_message>
<xml_diff>
--- a/docs/design-spec/Design Specifications - I5 (Updated).docx
+++ b/docs/design-spec/Design Specifications - I5 (Updated).docx
@@ -12227,8 +12227,9 @@
           <w:rFonts w:eastAsia="Times New Roman" w:cs="Times New Roman" w:ascii="Times New Roman" w:hAnsi="Times New Roman"/>
           <w:sz w:val="24"/>
           <w:szCs w:val="24"/>
-        </w:rPr>
-        <w:t xml:space="preserve"> - the system enforces Hampton University email validation at the service layer. Only emails ending in hamptonu.edu or my.hamptonu.edu are permitted to register, restricting marketplace access to verified Hampton University students.</w:t>
+          <w:highlight w:val="red"/>
+        </w:rPr>
+        <w:t xml:space="preserve"> - the system enforces Hampton University email validation at the service layer. Only emails ending in hamptonu.edu or my.hamptonu.edu are permitted to register, restricting marketplace access to verified Hampton University students. The service also requires a username of 3 to 50 characters and a password of 8 to 128 characters.</w:t>
       </w:r>
     </w:p>
     <w:p>
@@ -26632,6 +26633,137 @@
                 <w:szCs w:val="24"/>
               </w:rPr>
               <w:t>added content to sections 2.4, 3.7.2, 4.1.2, 6.4. Updated 3.1, 3.2.2, 3.2.3, 3.3.3.5-3.3.3.6, 3.4.1-3.4.3.6, 3.5-3.5.3.6, 3.6.2-3.6.3.6, 4.1.2 to reflect the fully completed and deployed product.</w:t>
+            </w:r>
+          </w:p>
+        </w:tc>
+      </w:tr>
+      <w:tr>
+        <w:trPr/>
+        <w:tc>
+          <w:tcPr>
+            <w:tcW w:w="2340" w:type="dxa"/>
+            <w:tcBorders>
+              <w:top w:val="single" w:sz="8" w:space="0" w:color="000000"/>
+              <w:start w:val="single" w:sz="8" w:space="0" w:color="000000"/>
+              <w:bottom w:val="single" w:sz="8" w:space="0" w:color="000000"/>
+              <w:end w:val="single" w:sz="8" w:space="0" w:color="000000"/>
+            </w:tcBorders>
+          </w:tcPr>
+          <w:p>
+            <w:pPr>
+              <w:pStyle w:val="normal1"/>
+              <w:widowControl w:val="false"/>
+              <w:spacing w:lineRule="auto" w:line="240"/>
+              <w:rPr>
+                <w:rFonts w:ascii="Times New Roman" w:hAnsi="Times New Roman" w:eastAsia="Times New Roman" w:cs="Times New Roman"/>
+                <w:sz w:val="24"/>
+                <w:szCs w:val="24"/>
+              </w:rPr>
+            </w:pPr>
+            <w:r>
+              <w:rPr>
+                <w:rFonts w:eastAsia="Times New Roman" w:cs="Times New Roman" w:ascii="Times New Roman" w:hAnsi="Times New Roman"/>
+                <w:sz w:val="24"/>
+                <w:szCs w:val="24"/>
+                <w:highlight w:val="red"/>
+              </w:rPr>
+              <w:t xml:space="preserve">6.0</w:t>
+            </w:r>
+          </w:p>
+        </w:tc>
+        <w:tc>
+          <w:tcPr>
+            <w:tcW w:w="2340" w:type="dxa"/>
+            <w:tcBorders>
+              <w:top w:val="single" w:sz="8" w:space="0" w:color="000000"/>
+              <w:start w:val="single" w:sz="8" w:space="0" w:color="000000"/>
+              <w:bottom w:val="single" w:sz="8" w:space="0" w:color="000000"/>
+              <w:end w:val="single" w:sz="8" w:space="0" w:color="000000"/>
+            </w:tcBorders>
+          </w:tcPr>
+          <w:p>
+            <w:pPr>
+              <w:pStyle w:val="normal1"/>
+              <w:widowControl w:val="false"/>
+              <w:spacing w:lineRule="auto" w:line="240"/>
+              <w:rPr>
+                <w:rFonts w:ascii="Times New Roman" w:hAnsi="Times New Roman" w:eastAsia="Times New Roman" w:cs="Times New Roman"/>
+                <w:sz w:val="24"/>
+                <w:szCs w:val="24"/>
+              </w:rPr>
+            </w:pPr>
+            <w:r>
+              <w:rPr>
+                <w:rFonts w:eastAsia="Times New Roman" w:cs="Times New Roman" w:ascii="Times New Roman" w:hAnsi="Times New Roman"/>
+                <w:sz w:val="24"/>
+                <w:szCs w:val="24"/>
+                <w:highlight w:val="red"/>
+              </w:rPr>
+              <w:t xml:space="preserve">Noah Higgs</w:t>
+            </w:r>
+          </w:p>
+        </w:tc>
+        <w:tc>
+          <w:tcPr>
+            <w:tcW w:w="2340" w:type="dxa"/>
+            <w:tcBorders>
+              <w:top w:val="single" w:sz="8" w:space="0" w:color="000000"/>
+              <w:start w:val="single" w:sz="8" w:space="0" w:color="000000"/>
+              <w:bottom w:val="single" w:sz="8" w:space="0" w:color="000000"/>
+              <w:end w:val="single" w:sz="8" w:space="0" w:color="000000"/>
+            </w:tcBorders>
+          </w:tcPr>
+          <w:p>
+            <w:pPr>
+              <w:pStyle w:val="normal1"/>
+              <w:widowControl w:val="false"/>
+              <w:spacing w:lineRule="auto" w:line="240"/>
+              <w:rPr>
+                <w:rFonts w:ascii="Times New Roman" w:hAnsi="Times New Roman" w:eastAsia="Times New Roman" w:cs="Times New Roman"/>
+                <w:sz w:val="24"/>
+                <w:szCs w:val="24"/>
+              </w:rPr>
+            </w:pPr>
+            <w:r>
+              <w:rPr>
+                <w:rFonts w:eastAsia="Times New Roman" w:cs="Times New Roman" w:ascii="Times New Roman" w:hAnsi="Times New Roman"/>
+                <w:sz w:val="24"/>
+                <w:szCs w:val="24"/>
+                <w:highlight w:val="red"/>
+              </w:rPr>
+              <w:t xml:space="preserve">10/27/2026</w:t>
+            </w:r>
+          </w:p>
+        </w:tc>
+        <w:tc>
+          <w:tcPr>
+            <w:tcW w:w="2340" w:type="dxa"/>
+            <w:tcBorders>
+              <w:top w:val="single" w:sz="8" w:space="0" w:color="000000"/>
+              <w:start w:val="single" w:sz="8" w:space="0" w:color="000000"/>
+              <w:bottom w:val="single" w:sz="8" w:space="0" w:color="000000"/>
+              <w:end w:val="single" w:sz="8" w:space="0" w:color="000000"/>
+            </w:tcBorders>
+          </w:tcPr>
+          <w:p>
+            <w:pPr>
+              <w:pStyle w:val="normal1"/>
+              <w:widowControl w:val="false"/>
+              <w:spacing w:lineRule="auto" w:line="240"/>
+              <w:rPr>
+                <w:rFonts w:ascii="Times New Roman" w:hAnsi="Times New Roman" w:eastAsia="Times New Roman" w:cs="Times New Roman"/>
+                <w:sz w:val="24"/>
+                <w:szCs w:val="24"/>
+              </w:rPr>
+            </w:pPr>
+            <w:r>
+              <w:rPr>
+                <w:rFonts w:eastAsia="Times New Roman" w:cs="Times New Roman" w:ascii="Times New Roman" w:hAnsi="Times New Roman"/>
+                <w:sz w:val="24"/>
+                <w:szCs w:val="24"/>
+                <w:highlight w:val="red"/>
+              </w:rPr>
+              <w:t xml:space="preserve">Added the signup username and password length rules to the registration constraint in section 4.1; every response now carries nosniff, frame, and referrer security headers; the app refuses a placeholder SECRET_KEY; order confirmation numbers use the secrets module.</w:t>
             </w:r>
           </w:p>
         </w:tc>

</xml_diff>